<commit_message>
Correct certification labels to match the actual certificates
All five cards named the platform vendor as issuer and dated the credential 2025. The certificates are completion certificates from Technical Virtual Assistants PH and Tara AI Community+, all dated 2026, and three cards promoted a course completion into a vendor credential (Expert, Certified Partner, Certified Expert). Titles now use each certificate's own wording with its real issuer and date, and the section subtitle says training rather than credentials. Resume certifications line updated to match. Also corrects the hero counter from 2+ to 4+ years, which the resume and the page's own experience timeline already stated.

Co-Authored-By: Claude Opus 5 <noreply@anthropic.com>
</commit_message>
<xml_diff>
--- a/assets/source/Reymarc_Almaden_Resume.docx
+++ b/assets/source/Reymarc_Almaden_Resume.docx
@@ -1103,7 +1103,7 @@
           <w:sz w:val="24"/>
           <w:szCs w:val="24"/>
         </w:rPr>
-        <w:t xml:space="preserve">Certifications</w:t>
+        <w:t xml:space="preserve">Training &amp; Certificates</w:t>
       </w:r>
     </w:p>
     <w:p>
@@ -1115,7 +1115,7 @@
           <w:sz w:val="20"/>
           <w:szCs w:val="20"/>
         </w:rPr>
-        <w:t xml:space="preserve">n8n | Zapier | Make | GoHighLevel (GHL) | AI Prompt Engineering</w:t>
+        <w:t xml:space="preserve">n8n, Make.com, Zapier — Technical Virtual Assistants PH, 2026  ·  HighLevel CRM, Prompt Engineering — Tara AI Community+, 2026</w:t>
       </w:r>
     </w:p>
     <w:p>

</xml_diff>